<commit_message>
A separate --flashcard-alpha for the cards (kuantorflow#201)
Three cases added to test_translucent_surfaces.py, two of which fail against
the old stylesheet.

The third passes either way by design: it asserts that the plain .panel on a
topic page — the empty-topic explanation (#127) — keeps the main page's value
rather than the card's. That was a decision, not a side effect of which
selector got edited, so it is written down as one.

The comparison test is the one worth having: it asserts a card is more opaque
than a main-page panel, which is the actual reason the variable exists, rather
than pinning 0.82 and needing an edit every time the number is tuned.

Catalog updated in the same commit: 38 files, 528 test functions, 579 cases.

Co-Authored-By: Claude Opus 5 <noreply@anthropic.com>
</commit_message>
<xml_diff>
--- a/docs/test-catalog.docx
+++ b/docs/test-catalog.docx
@@ -63,7 +63,7 @@
           <w:color w:val="22303C"/>
           <w:sz w:val="22"/>
         </w:rPr>
-        <w:t>576 test cases in 38 files</w:t>
+        <w:t>579 test cases in 38 files</w:t>
       </w:r>
     </w:p>
     <w:p>
@@ -221,7 +221,7 @@
                 <w:color w:val="22303C"/>
                 <w:sz w:val="20"/>
               </w:rPr>
-              <w:t>576 cases: 566 pass, 10 skip.</w:t>
+              <w:t>579 cases: 569 pass, 10 skip.</w:t>
             </w:r>
           </w:p>
         </w:tc>
@@ -274,7 +274,7 @@
                 <w:color w:val="22303C"/>
                 <w:sz w:val="20"/>
               </w:rPr>
-              <w:t xml:space="preserve"> — 570 cases, of which 560 pass and 10 skip. About 18 seconds, no network.</w:t>
+              <w:t xml:space="preserve"> — 573 cases, of which 563 pass and 10 skip. About 18 seconds, no network.</w:t>
             </w:r>
           </w:p>
         </w:tc>
@@ -802,7 +802,7 @@
           <w:color w:val="22303C"/>
           <w:sz w:val="22"/>
         </w:rPr>
-        <w:t xml:space="preserve"> counts, so the arithmetic reconciles with a test run. 525 test functions expand to 576 cases through </w:t>
+        <w:t xml:space="preserve"> counts, so the arithmetic reconciles with a test run. 528 test functions expand to 579 cases through </w:t>
       </w:r>
       <w:r>
         <w:rPr>
@@ -31419,7 +31419,7 @@
           <w:color w:val="2E6BA0"/>
           <w:sz w:val="30"/>
         </w:rPr>
-        <w:t>test_translucent_surfaces.py — half-transparent panels and widget (10 tests, 12 cases)</w:t>
+        <w:t>test_translucent_surfaces.py — half-transparent panels, widget and cards (13 tests, 15 cases)</w:t>
       </w:r>
     </w:p>
     <w:p>
@@ -31708,6 +31708,227 @@
                 <w:sz w:val="20"/>
               </w:rPr>
               <w:t>A backdrop blur hides the background, which is the thing being revealed.</w:t>
+            </w:r>
+          </w:p>
+        </w:tc>
+      </w:tr>
+    </w:tbl>
+    <w:p>
+      <w:pPr>
+        <w:spacing w:after="40"/>
+      </w:pPr>
+    </w:p>
+    <w:p>
+      <w:pPr>
+        <w:spacing w:after="120"/>
+      </w:pPr>
+      <w:r>
+        <w:rPr>
+          <w:b/>
+          <w:i w:val="0"/>
+          <w:color w:val="22303C"/>
+          <w:sz w:val="22"/>
+        </w:rPr>
+        <w:t>The flashcards page gets a third (#201)</w:t>
+      </w:r>
+    </w:p>
+    <w:tbl>
+      <w:tblPr>
+        <w:tblStyle w:val="TableGrid"/>
+        <w:tblW w:type="auto" w:w="0"/>
+        <w:jc w:val="left"/>
+        <w:tblLayout w:type="fixed"/>
+        <w:tblLook w:firstColumn="1" w:firstRow="1" w:lastColumn="0" w:lastRow="0" w:noHBand="0" w:noVBand="1" w:val="04A0"/>
+      </w:tblPr>
+      <w:tblGrid>
+        <w:gridCol w:w="4925"/>
+        <w:gridCol w:w="4925"/>
+      </w:tblGrid>
+      <w:tr>
+        <w:tc>
+          <w:tcPr>
+            <w:tcW w:type="dxa" w:w="1867"/>
+            <w:shd w:val="clear" w:fill="2E6BA0"/>
+          </w:tcPr>
+          <w:p>
+            <w:r>
+              <w:rPr>
+                <w:b/>
+                <w:i w:val="0"/>
+                <w:color w:val="FFFFFF"/>
+                <w:sz w:val="20"/>
+              </w:rPr>
+              <w:t>Test</w:t>
+            </w:r>
+          </w:p>
+        </w:tc>
+        <w:tc>
+          <w:tcPr>
+            <w:tcW w:type="dxa" w:w="7925"/>
+            <w:shd w:val="clear" w:fill="2E6BA0"/>
+          </w:tcPr>
+          <w:p>
+            <w:r>
+              <w:rPr>
+                <w:b/>
+                <w:i w:val="0"/>
+                <w:color w:val="FFFFFF"/>
+                <w:sz w:val="20"/>
+              </w:rPr>
+              <w:t>What it checks</w:t>
+            </w:r>
+          </w:p>
+        </w:tc>
+      </w:tr>
+      <w:tr>
+        <w:tc>
+          <w:tcPr>
+            <w:tcW w:type="dxa" w:w="1867"/>
+          </w:tcPr>
+          <w:p>
+            <w:r>
+              <w:rPr>
+                <w:rFonts w:ascii="Consolas" w:hAnsi="Consolas"/>
+                <w:b w:val="0"/>
+                <w:i w:val="0"/>
+                <w:color w:val="22303C"/>
+                <w:sz w:val="20"/>
+              </w:rPr>
+              <w:t>test_the_cards_have_their_own_opacity</w:t>
+            </w:r>
+          </w:p>
+        </w:tc>
+        <w:tc>
+          <w:tcPr>
+            <w:tcW w:type="dxa" w:w="7925"/>
+          </w:tcPr>
+          <w:p>
+            <w:r>
+              <w:rPr>
+                <w:rFonts w:ascii="Consolas" w:hAnsi="Consolas"/>
+                <w:b w:val="0"/>
+                <w:i w:val="0"/>
+                <w:color w:val="22303C"/>
+                <w:sz w:val="20"/>
+              </w:rPr>
+              <w:t>--flashcard-alpha</w:t>
+            </w:r>
+            <w:r>
+              <w:rPr>
+                <w:b w:val="0"/>
+                <w:i w:val="0"/>
+                <w:color w:val="22303C"/>
+                <w:sz w:val="20"/>
+              </w:rPr>
+              <w:t xml:space="preserve"> exists and </w:t>
+            </w:r>
+            <w:r>
+              <w:rPr>
+                <w:rFonts w:ascii="Consolas" w:hAnsi="Consolas"/>
+                <w:b w:val="0"/>
+                <w:i w:val="0"/>
+                <w:color w:val="22303C"/>
+                <w:sz w:val="20"/>
+              </w:rPr>
+              <w:t>.card</w:t>
+            </w:r>
+            <w:r>
+              <w:rPr>
+                <w:b w:val="0"/>
+                <w:i w:val="0"/>
+                <w:color w:val="22303C"/>
+                <w:sz w:val="20"/>
+              </w:rPr>
+              <w:t xml:space="preserve"> reads its background from it.</w:t>
+            </w:r>
+          </w:p>
+        </w:tc>
+      </w:tr>
+      <w:tr>
+        <w:tc>
+          <w:tcPr>
+            <w:tcW w:type="dxa" w:w="1867"/>
+          </w:tcPr>
+          <w:p>
+            <w:r>
+              <w:rPr>
+                <w:rFonts w:ascii="Consolas" w:hAnsi="Consolas"/>
+                <w:b w:val="0"/>
+                <w:i w:val="0"/>
+                <w:color w:val="22303C"/>
+                <w:sz w:val="20"/>
+              </w:rPr>
+              <w:t>test_a_card_is_more_opaque_than_a_main_page_panel</w:t>
+            </w:r>
+          </w:p>
+        </w:tc>
+        <w:tc>
+          <w:tcPr>
+            <w:tcW w:type="dxa" w:w="7925"/>
+          </w:tcPr>
+          <w:p>
+            <w:r>
+              <w:rPr>
+                <w:b w:val="0"/>
+                <w:i w:val="0"/>
+                <w:color w:val="22303C"/>
+                <w:sz w:val="20"/>
+              </w:rPr>
+              <w:t>Why it needs a number at all: the main page has three panels, a topic page has one per card — dozens, stacked, each carrying a word, a part of speech, an explanation and two translations with their examples.</w:t>
+            </w:r>
+          </w:p>
+        </w:tc>
+      </w:tr>
+      <w:tr>
+        <w:tc>
+          <w:tcPr>
+            <w:tcW w:type="dxa" w:w="1867"/>
+          </w:tcPr>
+          <w:p>
+            <w:r>
+              <w:rPr>
+                <w:rFonts w:ascii="Consolas" w:hAnsi="Consolas"/>
+                <w:b w:val="0"/>
+                <w:i w:val="0"/>
+                <w:color w:val="22303C"/>
+                <w:sz w:val="20"/>
+              </w:rPr>
+              <w:t>test_the_plain_panels_on_that_page_are_unaffected</w:t>
+            </w:r>
+          </w:p>
+        </w:tc>
+        <w:tc>
+          <w:tcPr>
+            <w:tcW w:type="dxa" w:w="7925"/>
+          </w:tcPr>
+          <w:p>
+            <w:r>
+              <w:rPr>
+                <w:b w:val="0"/>
+                <w:i w:val="0"/>
+                <w:color w:val="22303C"/>
+                <w:sz w:val="20"/>
+              </w:rPr>
+              <w:t xml:space="preserve">A topic page also renders an ordinary </w:t>
+            </w:r>
+            <w:r>
+              <w:rPr>
+                <w:rFonts w:ascii="Consolas" w:hAnsi="Consolas"/>
+                <w:b w:val="0"/>
+                <w:i w:val="0"/>
+                <w:color w:val="22303C"/>
+                <w:sz w:val="20"/>
+              </w:rPr>
+              <w:t>.panel</w:t>
+            </w:r>
+            <w:r>
+              <w:rPr>
+                <w:b w:val="0"/>
+                <w:i w:val="0"/>
+                <w:color w:val="22303C"/>
+                <w:sz w:val="20"/>
+              </w:rPr>
+              <w:t xml:space="preserve"> — the empty-topic explanation (#127) — and it keeps the main page's value, because it is doing the main page's job rather than the card's. Decided, not incidental.</w:t>
             </w:r>
           </w:p>
         </w:tc>
@@ -34161,7 +34382,7 @@
           <w:color w:val="22303C"/>
           <w:sz w:val="22"/>
         </w:rPr>
-        <w:t>Totals as of this revision: 38 files, 525 test functions, 576 collected cases</w:t>
+        <w:t>Totals as of this revision: 38 files, 528 test functions, 579 collected cases</w:t>
       </w:r>
       <w:r>
         <w:rPr>
@@ -34170,7 +34391,7 @@
           <w:color w:val="22303C"/>
           <w:sz w:val="22"/>
         </w:rPr>
-        <w:t xml:space="preserve"> (566 passing, 10 opt-in </w:t>
+        <w:t xml:space="preserve"> (569 passing, 10 opt-in </w:t>
       </w:r>
       <w:r>
         <w:rPr>

</xml_diff>

<commit_message>
Uploading notes requires an account (kuantorflow#200)
Six new cases. The load-bearing one asserts the parser is never called for a
refused upload — not that the response is a 403. A refusal that still parses
passes the obvious check and fails the entire purpose, which is not spending
the money.

Seven existing upload tests moved to user_client: trap 7 from the handover,
tightening a write rule breaks the tests that exercised the old freedom. One
assertion changed rather than moved — the PARSE line now names the signed-in
user instead of 'anonymous', which is the change showing up in the log.

Catalog: 39 files, 534 test functions, 585 cases.

Co-Authored-By: Claude Opus 5 <noreply@anthropic.com>
</commit_message>
<xml_diff>
--- a/docs/test-catalog.docx
+++ b/docs/test-catalog.docx
@@ -63,7 +63,7 @@
           <w:color w:val="22303C"/>
           <w:sz w:val="22"/>
         </w:rPr>
-        <w:t>579 test cases in 38 files</w:t>
+        <w:t>585 test cases in 39 files</w:t>
       </w:r>
     </w:p>
     <w:p>
@@ -221,7 +221,7 @@
                 <w:color w:val="22303C"/>
                 <w:sz w:val="20"/>
               </w:rPr>
-              <w:t>579 cases: 569 pass, 10 skip.</w:t>
+              <w:t>585 cases: 575 pass, 10 skip.</w:t>
             </w:r>
           </w:p>
         </w:tc>
@@ -274,7 +274,7 @@
                 <w:color w:val="22303C"/>
                 <w:sz w:val="20"/>
               </w:rPr>
-              <w:t xml:space="preserve"> — 573 cases, of which 563 pass and 10 skip. About 18 seconds, no network.</w:t>
+              <w:t xml:space="preserve"> — 579 cases, of which 569 pass and 10 skip. About 18 seconds, no network.</w:t>
             </w:r>
           </w:p>
         </w:tc>
@@ -802,7 +802,7 @@
           <w:color w:val="22303C"/>
           <w:sz w:val="22"/>
         </w:rPr>
-        <w:t xml:space="preserve"> counts, so the arithmetic reconciles with a test run. 528 test functions expand to 579 cases through </w:t>
+        <w:t xml:space="preserve"> counts, so the arithmetic reconciles with a test run. 534 test functions expand to 585 cases through </w:t>
       </w:r>
       <w:r>
         <w:rPr>
@@ -32677,6 +32677,410 @@
                 <w:sz w:val="20"/>
               </w:rPr>
               <w:t>Both images are actually served.</w:t>
+            </w:r>
+          </w:p>
+        </w:tc>
+      </w:tr>
+    </w:tbl>
+    <w:p>
+      <w:pPr>
+        <w:spacing w:after="40"/>
+      </w:pPr>
+    </w:p>
+    <w:p>
+      <w:pPr>
+        <w:pStyle w:val="Heading1"/>
+      </w:pPr>
+      <w:r>
+        <w:rPr>
+          <w:b w:val="0"/>
+          <w:i w:val="0"/>
+          <w:color w:val="2E6BA0"/>
+          <w:sz w:val="30"/>
+        </w:rPr>
+        <w:t>test_upload_needs_an_account.py — uploading notes requires an account (6 cases)</w:t>
+      </w:r>
+    </w:p>
+    <w:p>
+      <w:pPr>
+        <w:spacing w:after="120"/>
+      </w:pPr>
+      <w:r>
+        <w:rPr>
+          <w:b w:val="0"/>
+          <w:i w:val="0"/>
+          <w:color w:val="22303C"/>
+          <w:sz w:val="22"/>
+        </w:rPr>
+        <w:t xml:space="preserve">kuantorflow#200. Parsing a Reverso </w:t>
+      </w:r>
+      <w:r>
+        <w:rPr>
+          <w:rFonts w:ascii="Consolas" w:hAnsi="Consolas"/>
+          <w:b w:val="0"/>
+          <w:i w:val="0"/>
+          <w:color w:val="22303C"/>
+          <w:sz w:val="22"/>
+        </w:rPr>
+        <w:t>.mht</w:t>
+      </w:r>
+      <w:r>
+        <w:rPr>
+          <w:b w:val="0"/>
+          <w:i w:val="0"/>
+          <w:color w:val="22303C"/>
+          <w:sz w:val="22"/>
+        </w:rPr>
+        <w:t>/</w:t>
+      </w:r>
+      <w:r>
+        <w:rPr>
+          <w:rFonts w:ascii="Consolas" w:hAnsi="Consolas"/>
+          <w:b w:val="0"/>
+          <w:i w:val="0"/>
+          <w:color w:val="22303C"/>
+          <w:sz w:val="22"/>
+        </w:rPr>
+        <w:t>.docx</w:t>
+      </w:r>
+      <w:r>
+        <w:rPr>
+          <w:b w:val="0"/>
+          <w:i w:val="0"/>
+          <w:color w:val="22303C"/>
+          <w:sz w:val="22"/>
+        </w:rPr>
+        <w:t xml:space="preserve"> sends its glued translations to Claude (</w:t>
+      </w:r>
+      <w:r>
+        <w:rPr>
+          <w:rFonts w:ascii="Consolas" w:hAnsi="Consolas"/>
+          <w:b w:val="0"/>
+          <w:i w:val="0"/>
+          <w:color w:val="22303C"/>
+          <w:sz w:val="22"/>
+        </w:rPr>
+        <w:t>_split_glued_translations</w:t>
+      </w:r>
+      <w:r>
+        <w:rPr>
+          <w:b w:val="0"/>
+          <w:i w:val="0"/>
+          <w:color w:val="22303C"/>
+          <w:sz w:val="22"/>
+        </w:rPr>
+        <w:t xml:space="preserve">), and that happens </w:t>
+      </w:r>
+      <w:r>
+        <w:rPr>
+          <w:b/>
+          <w:i w:val="0"/>
+          <w:color w:val="22303C"/>
+          <w:sz w:val="22"/>
+        </w:rPr>
+        <w:t>before</w:t>
+      </w:r>
+      <w:r>
+        <w:rPr>
+          <w:b w:val="0"/>
+          <w:i w:val="0"/>
+          <w:color w:val="22303C"/>
+          <w:sz w:val="22"/>
+        </w:rPr>
+        <w:t xml:space="preserve"> the save — which #125 refuses for a visitor with no account. So an anonymous upload spent money producing cards the person was then not allowed to keep.</w:t>
+      </w:r>
+    </w:p>
+    <w:tbl>
+      <w:tblPr>
+        <w:tblStyle w:val="TableGrid"/>
+        <w:tblW w:type="auto" w:w="0"/>
+        <w:jc w:val="left"/>
+        <w:tblLayout w:type="fixed"/>
+        <w:tblLook w:firstColumn="1" w:firstRow="1" w:lastColumn="0" w:lastRow="0" w:noHBand="0" w:noVBand="1" w:val="04A0"/>
+      </w:tblPr>
+      <w:tblGrid>
+        <w:gridCol w:w="4925"/>
+        <w:gridCol w:w="4925"/>
+      </w:tblGrid>
+      <w:tr>
+        <w:tc>
+          <w:tcPr>
+            <w:tcW w:type="dxa" w:w="2426"/>
+            <w:shd w:val="clear" w:fill="2E6BA0"/>
+          </w:tcPr>
+          <w:p>
+            <w:r>
+              <w:rPr>
+                <w:b/>
+                <w:i w:val="0"/>
+                <w:color w:val="FFFFFF"/>
+                <w:sz w:val="20"/>
+              </w:rPr>
+              <w:t>Test</w:t>
+            </w:r>
+          </w:p>
+        </w:tc>
+        <w:tc>
+          <w:tcPr>
+            <w:tcW w:type="dxa" w:w="7366"/>
+            <w:shd w:val="clear" w:fill="2E6BA0"/>
+          </w:tcPr>
+          <w:p>
+            <w:r>
+              <w:rPr>
+                <w:b/>
+                <w:i w:val="0"/>
+                <w:color w:val="FFFFFF"/>
+                <w:sz w:val="20"/>
+              </w:rPr>
+              <w:t>What it checks</w:t>
+            </w:r>
+          </w:p>
+        </w:tc>
+      </w:tr>
+      <w:tr>
+        <w:tc>
+          <w:tcPr>
+            <w:tcW w:type="dxa" w:w="2426"/>
+          </w:tcPr>
+          <w:p>
+            <w:r>
+              <w:rPr>
+                <w:rFonts w:ascii="Consolas" w:hAnsi="Consolas"/>
+                <w:b w:val="0"/>
+                <w:i w:val="0"/>
+                <w:color w:val="22303C"/>
+                <w:sz w:val="20"/>
+              </w:rPr>
+              <w:t>test_an_anonymous_upload_never_reaches_the_parser</w:t>
+            </w:r>
+          </w:p>
+        </w:tc>
+        <w:tc>
+          <w:tcPr>
+            <w:tcW w:type="dxa" w:w="7366"/>
+          </w:tcPr>
+          <w:p>
+            <w:r>
+              <w:rPr>
+                <w:b w:val="0"/>
+                <w:i w:val="0"/>
+                <w:color w:val="22303C"/>
+                <w:sz w:val="20"/>
+              </w:rPr>
+              <w:t xml:space="preserve">The assertion that matters is not the status code but that the parser is </w:t>
+            </w:r>
+            <w:r>
+              <w:rPr>
+                <w:b/>
+                <w:i w:val="0"/>
+                <w:color w:val="22303C"/>
+                <w:sz w:val="20"/>
+              </w:rPr>
+              <w:t>never called</w:t>
+            </w:r>
+            <w:r>
+              <w:rPr>
+                <w:b w:val="0"/>
+                <w:i w:val="0"/>
+                <w:color w:val="22303C"/>
+                <w:sz w:val="20"/>
+              </w:rPr>
+              <w:t xml:space="preserve"> — a refusal that still parses passes the obvious check and fails the entire purpose.</w:t>
+            </w:r>
+          </w:p>
+        </w:tc>
+      </w:tr>
+      <w:tr>
+        <w:tc>
+          <w:tcPr>
+            <w:tcW w:type="dxa" w:w="2426"/>
+          </w:tcPr>
+          <w:p>
+            <w:r>
+              <w:rPr>
+                <w:rFonts w:ascii="Consolas" w:hAnsi="Consolas"/>
+                <w:b w:val="0"/>
+                <w:i w:val="0"/>
+                <w:color w:val="22303C"/>
+                <w:sz w:val="20"/>
+              </w:rPr>
+              <w:t>test_a_blocked_account_never_reaches_it_either</w:t>
+            </w:r>
+          </w:p>
+        </w:tc>
+        <w:tc>
+          <w:tcPr>
+            <w:tcW w:type="dxa" w:w="7366"/>
+          </w:tcPr>
+          <w:p>
+            <w:r>
+              <w:rPr>
+                <w:b w:val="0"/>
+                <w:i w:val="0"/>
+                <w:color w:val="22303C"/>
+                <w:sz w:val="20"/>
+              </w:rPr>
+              <w:t>They have an account but may not write, so the same reasoning holds (#126).</w:t>
+            </w:r>
+          </w:p>
+        </w:tc>
+      </w:tr>
+      <w:tr>
+        <w:tc>
+          <w:tcPr>
+            <w:tcW w:type="dxa" w:w="2426"/>
+          </w:tcPr>
+          <w:p>
+            <w:r>
+              <w:rPr>
+                <w:rFonts w:ascii="Consolas" w:hAnsi="Consolas"/>
+                <w:b w:val="0"/>
+                <w:i w:val="0"/>
+                <w:color w:val="22303C"/>
+                <w:sz w:val="20"/>
+              </w:rPr>
+              <w:t>test_a_signed_in_upload_still_parses</w:t>
+            </w:r>
+          </w:p>
+        </w:tc>
+        <w:tc>
+          <w:tcPr>
+            <w:tcW w:type="dxa" w:w="7366"/>
+          </w:tcPr>
+          <w:p>
+            <w:r>
+              <w:rPr>
+                <w:b w:val="0"/>
+                <w:i w:val="0"/>
+                <w:color w:val="22303C"/>
+                <w:sz w:val="20"/>
+              </w:rPr>
+              <w:t>The control case: the feature is unchanged for anyone who can actually keep the result.</w:t>
+            </w:r>
+          </w:p>
+        </w:tc>
+      </w:tr>
+      <w:tr>
+        <w:tc>
+          <w:tcPr>
+            <w:tcW w:type="dxa" w:w="2426"/>
+          </w:tcPr>
+          <w:p>
+            <w:r>
+              <w:rPr>
+                <w:rFonts w:ascii="Consolas" w:hAnsi="Consolas"/>
+                <w:b w:val="0"/>
+                <w:i w:val="0"/>
+                <w:color w:val="22303C"/>
+                <w:sz w:val="20"/>
+              </w:rPr>
+              <w:t>test_the_refusal_prompts_the_visitor_to_sign_in</w:t>
+            </w:r>
+          </w:p>
+        </w:tc>
+        <w:tc>
+          <w:tcPr>
+            <w:tcW w:type="dxa" w:w="7366"/>
+          </w:tcPr>
+          <w:p>
+            <w:r>
+              <w:rPr>
+                <w:b w:val="0"/>
+                <w:i w:val="0"/>
+                <w:color w:val="22303C"/>
+                <w:sz w:val="20"/>
+              </w:rPr>
+              <w:t>The refusal raises the same sign-in dialog the review popup raises, rather than an error banner.</w:t>
+            </w:r>
+          </w:p>
+        </w:tc>
+      </w:tr>
+      <w:tr>
+        <w:tc>
+          <w:tcPr>
+            <w:tcW w:type="dxa" w:w="2426"/>
+          </w:tcPr>
+          <w:p>
+            <w:r>
+              <w:rPr>
+                <w:rFonts w:ascii="Consolas" w:hAnsi="Consolas"/>
+                <w:b w:val="0"/>
+                <w:i w:val="0"/>
+                <w:color w:val="22303C"/>
+                <w:sz w:val="20"/>
+              </w:rPr>
+              <w:t>test_the_blocked_wording_is_not_the_sign_in_wording</w:t>
+            </w:r>
+          </w:p>
+        </w:tc>
+        <w:tc>
+          <w:tcPr>
+            <w:tcW w:type="dxa" w:w="7366"/>
+          </w:tcPr>
+          <w:p>
+            <w:r>
+              <w:rPr>
+                <w:b w:val="0"/>
+                <w:i w:val="0"/>
+                <w:color w:val="22303C"/>
+                <w:sz w:val="20"/>
+              </w:rPr>
+              <w:t>A blocked visitor is signed in already; telling them to sign in would send them round a loop that changes nothing.</w:t>
+            </w:r>
+          </w:p>
+        </w:tc>
+      </w:tr>
+      <w:tr>
+        <w:tc>
+          <w:tcPr>
+            <w:tcW w:type="dxa" w:w="2426"/>
+          </w:tcPr>
+          <w:p>
+            <w:r>
+              <w:rPr>
+                <w:rFonts w:ascii="Consolas" w:hAnsi="Consolas"/>
+                <w:b w:val="0"/>
+                <w:i w:val="0"/>
+                <w:color w:val="22303C"/>
+                <w:sz w:val="20"/>
+              </w:rPr>
+              <w:t>test_every_upload_is_refused_not_only_the_expensive_ones</w:t>
+            </w:r>
+          </w:p>
+        </w:tc>
+        <w:tc>
+          <w:tcPr>
+            <w:tcW w:type="dxa" w:w="7366"/>
+          </w:tcPr>
+          <w:p>
+            <w:r>
+              <w:rPr>
+                <w:b w:val="0"/>
+                <w:i w:val="0"/>
+                <w:color w:val="22303C"/>
+                <w:sz w:val="20"/>
+              </w:rPr>
+              <w:t xml:space="preserve">A plain </w:t>
+            </w:r>
+            <w:r>
+              <w:rPr>
+                <w:rFonts w:ascii="Consolas" w:hAnsi="Consolas"/>
+                <w:b w:val="0"/>
+                <w:i w:val="0"/>
+                <w:color w:val="22303C"/>
+                <w:sz w:val="20"/>
+              </w:rPr>
+              <w:t>.txt</w:t>
+            </w:r>
+            <w:r>
+              <w:rPr>
+                <w:b w:val="0"/>
+                <w:i w:val="0"/>
+                <w:color w:val="22303C"/>
+                <w:sz w:val="20"/>
+              </w:rPr>
+              <w:t xml:space="preserve"> is refused too: which file calls Claude cannot be known without parsing it, and parsing is the thing being paid for.</w:t>
             </w:r>
           </w:p>
         </w:tc>
@@ -34382,7 +34786,7 @@
           <w:color w:val="22303C"/>
           <w:sz w:val="22"/>
         </w:rPr>
-        <w:t>Totals as of this revision: 38 files, 528 test functions, 579 collected cases</w:t>
+        <w:t>Totals as of this revision: 39 files, 534 test functions, 585 collected cases</w:t>
       </w:r>
       <w:r>
         <w:rPr>
@@ -34391,7 +34795,7 @@
           <w:color w:val="22303C"/>
           <w:sz w:val="22"/>
         </w:rPr>
-        <w:t xml:space="preserve"> (569 passing, 10 opt-in </w:t>
+        <w:t xml:space="preserve"> (575 passing, 10 opt-in </w:t>
       </w:r>
       <w:r>
         <w:rPr>

</xml_diff>